<commit_message>
Convert html report to docx
</commit_message>
<xml_diff>
--- a/analysis_report_alt_outcome_definition/eliminate_rabies_trial_analysis_report_v1.0.docx
+++ b/analysis_report_alt_outcome_definition/eliminate_rabies_trial_analysis_report_v1.0.docx
@@ -20005,7 +20005,7 @@
       <w:rPr>
         <w:noProof/>
       </w:rPr>
-      <w:pict w14:anchorId="52911864">
+      <w:pict w14:anchorId="0C100466">
         <v:shapetype id="_x0000_t136" coordsize="21600,21600" o:spt="136" adj="10800" path="m@7,l@8,m@5,21600l@6,21600e">
           <v:formulas>
             <v:f eqn="sum #0 0 10800"/>
@@ -20032,6 +20032,7 @@
         </v:shapetype>
         <v:shape id="PowerPlusWaterMarkObject216789521" o:spid="_x0000_s1027" type="#_x0000_t136" alt="" style="position:absolute;margin-left:0;margin-top:0;width:605.3pt;height:57.25pt;rotation:315;z-index:-251651072;mso-wrap-edited:f;mso-width-percent:0;mso-height-percent:0;mso-position-horizontal:center;mso-position-horizontal-relative:margin;mso-position-vertical:center;mso-position-vertical-relative:margin;mso-width-percent:0;mso-height-percent:0" o:allowincell="f" fillcolor="silver" stroked="f">
           <v:textpath style="font-family:&quot;Times New Roman&quot;;font-size:1pt" string="Alternative outcome definition"/>
+          <w10:wrap anchorx="margin" anchory="margin"/>
         </v:shape>
       </w:pict>
     </w:r>
@@ -20056,7 +20057,7 @@
       <w:rPr>
         <w:noProof/>
       </w:rPr>
-      <w:pict w14:anchorId="2D169195">
+      <w:pict w14:anchorId="48DBEFF0">
         <v:shapetype id="_x0000_t136" coordsize="21600,21600" o:spt="136" adj="10800" path="m@7,l@8,m@5,21600l@6,21600e">
           <v:formulas>
             <v:f eqn="sum #0 0 10800"/>
@@ -20083,6 +20084,7 @@
         </v:shapetype>
         <v:shape id="PowerPlusWaterMarkObject216789522" o:spid="_x0000_s1026" type="#_x0000_t136" alt="" style="position:absolute;left:0;text-align:left;margin-left:0;margin-top:0;width:605.3pt;height:57.25pt;rotation:315;z-index:-251646976;mso-wrap-edited:f;mso-width-percent:0;mso-height-percent:0;mso-position-horizontal:center;mso-position-horizontal-relative:margin;mso-position-vertical:center;mso-position-vertical-relative:margin;mso-width-percent:0;mso-height-percent:0" o:allowincell="f" fillcolor="silver" stroked="f">
           <v:textpath style="font-family:&quot;Times New Roman&quot;;font-size:1pt" string="Alternative outcome definition"/>
+          <w10:wrap anchorx="margin" anchory="margin"/>
         </v:shape>
       </w:pict>
     </w:r>
@@ -20108,7 +20110,7 @@
       <w:rPr>
         <w:noProof/>
       </w:rPr>
-      <w:pict w14:anchorId="0D2C597E">
+      <w:pict w14:anchorId="59BF5943">
         <v:shapetype id="_x0000_t136" coordsize="21600,21600" o:spt="136" adj="10800" path="m@7,l@8,m@5,21600l@6,21600e">
           <v:formulas>
             <v:f eqn="sum #0 0 10800"/>
@@ -20135,6 +20137,7 @@
         </v:shapetype>
         <v:shape id="PowerPlusWaterMarkObject216789520" o:spid="_x0000_s1025" type="#_x0000_t136" alt="" style="position:absolute;margin-left:0;margin-top:0;width:605.3pt;height:57.25pt;rotation:315;z-index:-251655168;mso-wrap-edited:f;mso-width-percent:0;mso-height-percent:0;mso-position-horizontal:center;mso-position-horizontal-relative:margin;mso-position-vertical:center;mso-position-vertical-relative:margin;mso-width-percent:0;mso-height-percent:0" o:allowincell="f" fillcolor="silver" stroked="f">
           <v:textpath style="font-family:&quot;Times New Roman&quot;;font-size:1pt" string="Alternative outcome definition"/>
+          <w10:wrap anchorx="margin" anchory="margin"/>
         </v:shape>
       </w:pict>
     </w:r>

</xml_diff>